<commit_message>
feat(about): add About page with platform details and capabilities
</commit_message>
<xml_diff>
--- a/frontend/docs/co-creation platform project brief-revised.docx
+++ b/frontend/docs/co-creation platform project brief-revised.docx
@@ -71,6 +71,7 @@
       <w:r>
         <w:rPr>
           <w:rFonts w:ascii="Libre Baskerville" w:eastAsia="Libre Baskerville" w:hAnsi="Libre Baskerville" w:cs="Libre Baskerville"/>
+          <w:noProof/>
           <w:color w:val="403CCF"/>
           <w:kern w:val="24"/>
           <w:sz w:val="48"/>
@@ -3379,12 +3380,15 @@
       </w:pPr>
       <w:r>
         <w:rPr>
-          <w:rFonts w:ascii="Times New Roman" w:eastAsia="Times New Roman" w:hAnsi="Times New Roman" w:cs="Times New Roman"/>
           <w:noProof/>
-          <w:kern w:val="0"/>
-        </w:rPr>
-        <w:pict w14:anchorId="5F80CB3A">
-          <v:rect id="_x0000_i1031" alt="" style="width:468pt;height:.05pt;mso-width-percent:0;mso-height-percent:0;mso-width-percent:0;mso-height-percent:0" o:hralign="center" o:hrstd="t" o:hr="t" fillcolor="#a0a0a0" stroked="f"/>
+        </w:rPr>
+      </w:r>
+      <w:r>
+        <w:pict w14:anchorId="191F90BA">
+          <v:rect id="Horizontal Line 1" o:spid="_x0000_s1032" style="width:468pt;height:.05pt;visibility:visible;mso-wrap-style:square;mso-left-percent:-10001;mso-top-percent:-10001;mso-position-horizontal:absolute;mso-position-horizontal-relative:char;mso-position-vertical:absolute;mso-position-vertical-relative:line;mso-left-percent:-10001;mso-top-percent:-10001;v-text-anchor:top" o:gfxdata="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" filled="f">
+            <o:lock v:ext="edit" rotation="t" aspectratio="t" verticies="t" text="t" shapetype="t"/>
+            <w10:anchorlock/>
+          </v:rect>
         </w:pict>
       </w:r>
     </w:p>
@@ -3462,6 +3466,7 @@
           <w:rFonts w:ascii="Times New Roman" w:eastAsia="Times New Roman" w:hAnsi="Times New Roman" w:cs="Times New Roman"/>
           <w:b/>
           <w:bCs/>
+          <w:noProof/>
           <w:kern w:val="36"/>
           <w:sz w:val="48"/>
           <w:szCs w:val="48"/>
@@ -3690,12 +3695,15 @@
       </w:pPr>
       <w:r>
         <w:rPr>
-          <w:rFonts w:ascii="Times New Roman" w:eastAsia="Times New Roman" w:hAnsi="Times New Roman" w:cs="Times New Roman"/>
           <w:noProof/>
-          <w:kern w:val="0"/>
-        </w:rPr>
-        <w:pict w14:anchorId="0CFC02D0">
-          <v:rect id="_x0000_i1030" alt="" style="width:468pt;height:.05pt;mso-width-percent:0;mso-height-percent:0;mso-width-percent:0;mso-height-percent:0" o:hralign="center" o:hrstd="t" o:hr="t" fillcolor="#a0a0a0" stroked="f"/>
+        </w:rPr>
+      </w:r>
+      <w:r>
+        <w:pict w14:anchorId="29A5D329">
+          <v:rect id="Horizontal Line 2" o:spid="_x0000_s1031" style="width:468pt;height:.05pt;visibility:visible;mso-wrap-style:square;mso-left-percent:-10001;mso-top-percent:-10001;mso-position-horizontal:absolute;mso-position-horizontal-relative:char;mso-position-vertical:absolute;mso-position-vertical-relative:line;mso-left-percent:-10001;mso-top-percent:-10001;v-text-anchor:top" o:gfxdata="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" filled="f">
+            <o:lock v:ext="edit" rotation="t" aspectratio="t" verticies="t" text="t" shapetype="t"/>
+            <w10:anchorlock/>
+          </v:rect>
         </w:pict>
       </w:r>
     </w:p>
@@ -4732,12 +4740,15 @@
       </w:pPr>
       <w:r>
         <w:rPr>
-          <w:rFonts w:ascii="Times New Roman" w:eastAsia="Times New Roman" w:hAnsi="Times New Roman" w:cs="Times New Roman"/>
           <w:noProof/>
-          <w:kern w:val="0"/>
-        </w:rPr>
-        <w:pict w14:anchorId="1B89AC81">
-          <v:rect id="_x0000_i1029" alt="" style="width:468pt;height:.05pt;mso-width-percent:0;mso-height-percent:0;mso-width-percent:0;mso-height-percent:0" o:hralign="center" o:hrstd="t" o:hr="t" fillcolor="#a0a0a0" stroked="f"/>
+        </w:rPr>
+      </w:r>
+      <w:r>
+        <w:pict w14:anchorId="40FD7C32">
+          <v:rect id="Horizontal Line 3" o:spid="_x0000_s1030" style="width:468pt;height:.05pt;visibility:visible;mso-wrap-style:square;mso-left-percent:-10001;mso-top-percent:-10001;mso-position-horizontal:absolute;mso-position-horizontal-relative:char;mso-position-vertical:absolute;mso-position-vertical-relative:line;mso-left-percent:-10001;mso-top-percent:-10001;v-text-anchor:top" o:gfxdata="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" filled="f">
+            <o:lock v:ext="edit" rotation="t" aspectratio="t" verticies="t" text="t" shapetype="t"/>
+            <w10:anchorlock/>
+          </v:rect>
         </w:pict>
       </w:r>
     </w:p>
@@ -4978,12 +4989,15 @@
       </w:pPr>
       <w:r>
         <w:rPr>
-          <w:rFonts w:ascii="Times New Roman" w:eastAsia="Times New Roman" w:hAnsi="Times New Roman" w:cs="Times New Roman"/>
           <w:noProof/>
-          <w:kern w:val="0"/>
-        </w:rPr>
-        <w:pict w14:anchorId="12DDE07B">
-          <v:rect id="_x0000_i1028" alt="" style="width:468pt;height:.05pt;mso-width-percent:0;mso-height-percent:0;mso-width-percent:0;mso-height-percent:0" o:hralign="center" o:hrstd="t" o:hr="t" fillcolor="#a0a0a0" stroked="f"/>
+        </w:rPr>
+      </w:r>
+      <w:r>
+        <w:pict w14:anchorId="32F50642">
+          <v:rect id="Horizontal Line 4" o:spid="_x0000_s1029" style="width:468pt;height:.05pt;visibility:visible;mso-wrap-style:square;mso-left-percent:-10001;mso-top-percent:-10001;mso-position-horizontal:absolute;mso-position-horizontal-relative:char;mso-position-vertical:absolute;mso-position-vertical-relative:line;mso-left-percent:-10001;mso-top-percent:-10001;v-text-anchor:top" o:gfxdata="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" filled="f">
+            <o:lock v:ext="edit" rotation="t" aspectratio="t" verticies="t" text="t" shapetype="t"/>
+            <w10:anchorlock/>
+          </v:rect>
         </w:pict>
       </w:r>
     </w:p>
@@ -5166,12 +5180,15 @@
       </w:pPr>
       <w:r>
         <w:rPr>
-          <w:rFonts w:ascii="Times New Roman" w:eastAsia="Times New Roman" w:hAnsi="Times New Roman" w:cs="Times New Roman"/>
           <w:noProof/>
-          <w:kern w:val="0"/>
-        </w:rPr>
-        <w:pict w14:anchorId="5AFFFE56">
-          <v:rect id="_x0000_i1027" alt="" style="width:468pt;height:.05pt;mso-width-percent:0;mso-height-percent:0;mso-width-percent:0;mso-height-percent:0" o:hralign="center" o:hrstd="t" o:hr="t" fillcolor="#a0a0a0" stroked="f"/>
+        </w:rPr>
+      </w:r>
+      <w:r>
+        <w:pict w14:anchorId="19F1F097">
+          <v:rect id="Horizontal Line 5" o:spid="_x0000_s1028" style="width:468pt;height:.05pt;visibility:visible;mso-wrap-style:square;mso-left-percent:-10001;mso-top-percent:-10001;mso-position-horizontal:absolute;mso-position-horizontal-relative:char;mso-position-vertical:absolute;mso-position-vertical-relative:line;mso-left-percent:-10001;mso-top-percent:-10001;v-text-anchor:top" o:gfxdata="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" filled="f">
+            <o:lock v:ext="edit" rotation="t" aspectratio="t" verticies="t" text="t" shapetype="t"/>
+            <w10:anchorlock/>
+          </v:rect>
         </w:pict>
       </w:r>
     </w:p>
@@ -5567,13 +5584,15 @@
       </w:pPr>
       <w:r>
         <w:rPr>
-          <w:rFonts w:ascii="Times New Roman" w:eastAsia="Times New Roman" w:hAnsi="Times New Roman" w:cs="Times New Roman"/>
           <w:noProof/>
-          <w:kern w:val="0"/>
-        </w:rPr>
-        <w:lastRenderedPageBreak/>
-        <w:pict w14:anchorId="52928B3F">
-          <v:rect id="_x0000_i1026" alt="" style="width:468pt;height:.05pt;mso-width-percent:0;mso-height-percent:0;mso-width-percent:0;mso-height-percent:0" o:hralign="center" o:hrstd="t" o:hr="t" fillcolor="#a0a0a0" stroked="f"/>
+        </w:rPr>
+      </w:r>
+      <w:r>
+        <w:pict w14:anchorId="01A44B2A">
+          <v:rect id="Horizontal Line 6" o:spid="_x0000_s1027" style="width:468pt;height:.05pt;visibility:visible;mso-wrap-style:square;mso-left-percent:-10001;mso-top-percent:-10001;mso-position-horizontal:absolute;mso-position-horizontal-relative:char;mso-position-vertical:absolute;mso-position-vertical-relative:line;mso-left-percent:-10001;mso-top-percent:-10001;v-text-anchor:top" o:gfxdata="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" filled="f">
+            <o:lock v:ext="edit" rotation="t" aspectratio="t" verticies="t" text="t" shapetype="t"/>
+            <w10:anchorlock/>
+          </v:rect>
         </w:pict>
       </w:r>
     </w:p>
@@ -6252,12 +6271,15 @@
       </w:pPr>
       <w:r>
         <w:rPr>
-          <w:rFonts w:ascii="Times New Roman" w:eastAsia="Times New Roman" w:hAnsi="Times New Roman" w:cs="Times New Roman"/>
           <w:noProof/>
-          <w:kern w:val="0"/>
-        </w:rPr>
-        <w:pict w14:anchorId="7C08ED5F">
-          <v:rect id="_x0000_i1025" alt="" style="width:468pt;height:.05pt;mso-width-percent:0;mso-height-percent:0;mso-width-percent:0;mso-height-percent:0" o:hralign="center" o:hrstd="t" o:hr="t" fillcolor="#a0a0a0" stroked="f"/>
+        </w:rPr>
+      </w:r>
+      <w:r>
+        <w:pict w14:anchorId="295D70B9">
+          <v:rect id="Horizontal Line 7" o:spid="_x0000_s1026" style="width:468pt;height:.05pt;visibility:visible;mso-wrap-style:square;mso-left-percent:-10001;mso-top-percent:-10001;mso-position-horizontal:absolute;mso-position-horizontal-relative:char;mso-position-vertical:absolute;mso-position-vertical-relative:line;mso-left-percent:-10001;mso-top-percent:-10001;v-text-anchor:top" o:gfxdata="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" filled="f">
+            <o:lock v:ext="edit" rotation="t" aspectratio="t" verticies="t" text="t" shapetype="t"/>
+            <w10:anchorlock/>
+          </v:rect>
         </w:pict>
       </w:r>
     </w:p>
@@ -7293,6 +7315,7 @@
         <w:spacing w:before="100" w:beforeAutospacing="1" w:after="100" w:afterAutospacing="1" w:line="240" w:lineRule="auto"/>
         <w:outlineLvl w:val="0"/>
         <w:rPr>
+          <w:del w:id="1" w:author="sevgi koyuncu" w:date="2026-03-31T15:21:00Z" w16du:dateUtc="2026-03-31T12:21:00Z"/>
           <w:rFonts w:ascii="Times New Roman" w:eastAsia="Times New Roman" w:hAnsi="Times New Roman" w:cs="Times New Roman"/>
           <w:b/>
           <w:bCs/>
@@ -7302,60 +7325,64 @@
           <w14:ligatures w14:val="none"/>
         </w:rPr>
       </w:pPr>
-      <w:r>
-        <w:rPr>
-          <w:rFonts w:ascii="Times New Roman" w:eastAsia="Times New Roman" w:hAnsi="Times New Roman" w:cs="Times New Roman"/>
-          <w:b/>
-          <w:bCs/>
-          <w:kern w:val="36"/>
-          <w:sz w:val="48"/>
-          <w:szCs w:val="48"/>
-          <w14:ligatures w14:val="none"/>
-        </w:rPr>
-        <w:t>8. End-of-Semester Competition</w:t>
-      </w:r>
-    </w:p>
-    <w:p>
-      <w:r>
-        <w:rPr>
-          <w:noProof/>
-        </w:rPr>
-        <w:drawing>
-          <wp:inline distT="0" distB="0" distL="0" distR="0" wp14:anchorId="321A89EE" wp14:editId="4F41128A">
-            <wp:extent cx="5943600" cy="1304290"/>
-            <wp:effectExtent l="0" t="0" r="0" b="3810"/>
-            <wp:docPr id="670458595" name="Picture 1" descr="A close-up of a text&#10;&#10;AI-generated content may be incorrect."/>
-            <wp:cNvGraphicFramePr>
-              <a:graphicFrameLocks xmlns:a="http://schemas.openxmlformats.org/drawingml/2006/main" noChangeAspect="1"/>
-            </wp:cNvGraphicFramePr>
-            <a:graphic xmlns:a="http://schemas.openxmlformats.org/drawingml/2006/main">
-              <a:graphicData uri="http://schemas.openxmlformats.org/drawingml/2006/picture">
-                <pic:pic xmlns:pic="http://schemas.openxmlformats.org/drawingml/2006/picture">
-                  <pic:nvPicPr>
-                    <pic:cNvPr id="670458595" name="Picture 1" descr="A close-up of a text&#10;&#10;AI-generated content may be incorrect."/>
-                    <pic:cNvPicPr/>
-                  </pic:nvPicPr>
-                  <pic:blipFill>
-                    <a:blip r:embed="rId11"/>
-                    <a:stretch>
-                      <a:fillRect/>
-                    </a:stretch>
-                  </pic:blipFill>
-                  <pic:spPr>
-                    <a:xfrm>
-                      <a:off x="0" y="0"/>
-                      <a:ext cx="5943600" cy="1304290"/>
-                    </a:xfrm>
-                    <a:prstGeom prst="rect">
-                      <a:avLst/>
-                    </a:prstGeom>
-                  </pic:spPr>
-                </pic:pic>
-              </a:graphicData>
-            </a:graphic>
-          </wp:inline>
-        </w:drawing>
-      </w:r>
+      <w:del w:id="2" w:author="sevgi koyuncu" w:date="2026-03-31T15:21:00Z" w16du:dateUtc="2026-03-31T12:21:00Z">
+        <w:r>
+          <w:rPr>
+            <w:rFonts w:ascii="Times New Roman" w:eastAsia="Times New Roman" w:hAnsi="Times New Roman" w:cs="Times New Roman"/>
+            <w:b/>
+            <w:bCs/>
+            <w:kern w:val="36"/>
+            <w:sz w:val="48"/>
+            <w:szCs w:val="48"/>
+            <w14:ligatures w14:val="none"/>
+          </w:rPr>
+          <w:delText>8. End-of-Semester Competition</w:delText>
+        </w:r>
+      </w:del>
+    </w:p>
+    <w:p>
+      <w:del w:id="3" w:author="sevgi koyuncu" w:date="2026-03-31T15:21:00Z" w16du:dateUtc="2026-03-31T12:21:00Z">
+        <w:r>
+          <w:rPr>
+            <w:noProof/>
+          </w:rPr>
+          <w:drawing>
+            <wp:inline distT="0" distB="0" distL="0" distR="0" wp14:anchorId="321A89EE" wp14:editId="68DB4444">
+              <wp:extent cx="5943600" cy="1304290"/>
+              <wp:effectExtent l="0" t="0" r="0" b="3810"/>
+              <wp:docPr id="670458595" name="Picture 1" descr="A close-up of a text&#10;&#10;AI-generated content may be incorrect."/>
+              <wp:cNvGraphicFramePr>
+                <a:graphicFrameLocks xmlns:a="http://schemas.openxmlformats.org/drawingml/2006/main" noChangeAspect="1"/>
+              </wp:cNvGraphicFramePr>
+              <a:graphic xmlns:a="http://schemas.openxmlformats.org/drawingml/2006/main">
+                <a:graphicData uri="http://schemas.openxmlformats.org/drawingml/2006/picture">
+                  <pic:pic xmlns:pic="http://schemas.openxmlformats.org/drawingml/2006/picture">
+                    <pic:nvPicPr>
+                      <pic:cNvPr id="670458595" name="Picture 1" descr="A close-up of a text&#10;&#10;AI-generated content may be incorrect."/>
+                      <pic:cNvPicPr/>
+                    </pic:nvPicPr>
+                    <pic:blipFill>
+                      <a:blip r:embed="rId11"/>
+                      <a:stretch>
+                        <a:fillRect/>
+                      </a:stretch>
+                    </pic:blipFill>
+                    <pic:spPr>
+                      <a:xfrm>
+                        <a:off x="0" y="0"/>
+                        <a:ext cx="5943600" cy="1304290"/>
+                      </a:xfrm>
+                      <a:prstGeom prst="rect">
+                        <a:avLst/>
+                      </a:prstGeom>
+                    </pic:spPr>
+                  </pic:pic>
+                </a:graphicData>
+              </a:graphic>
+            </wp:inline>
+          </w:drawing>
+        </w:r>
+      </w:del>
     </w:p>
     <w:sectPr>
       <w:pgSz w:w="12240" w:h="15840"/>
@@ -12283,6 +12310,9 @@
 <w15:people xmlns:wpc="http://schemas.microsoft.com/office/word/2010/wordprocessingCanvas" xmlns:cx="http://schemas.microsoft.com/office/drawing/2014/chartex" xmlns:cx1="http://schemas.microsoft.com/office/drawing/2015/9/8/chartex" xmlns:cx2="http://schemas.microsoft.com/office/drawing/2015/10/21/chartex" xmlns:cx3="http://schemas.microsoft.com/office/drawing/2016/5/9/chartex" xmlns:cx4="http://schemas.microsoft.com/office/drawing/2016/5/10/chartex" xmlns:cx5="http://schemas.microsoft.com/office/drawing/2016/5/11/chartex" xmlns:cx6="http://schemas.microsoft.com/office/drawing/2016/5/12/chartex" xmlns:cx7="http://schemas.microsoft.com/office/drawing/2016/5/13/chartex" xmlns:cx8="http://schemas.microsoft.com/office/drawing/2016/5/14/chartex" xmlns:mc="http://schemas.openxmlformats.org/markup-compatibility/2006" xmlns:aink="http://schemas.microsoft.com/office/drawing/2016/ink" xmlns:am3d="http://schemas.microsoft.com/office/drawing/2017/model3d" xmlns:o="urn:schemas-microsoft-com:office:office" xmlns:oel="http://schemas.microsoft.com/office/2019/extlst" xmlns:r="http://schemas.openxmlformats.org/officeDocument/2006/relationships" xmlns:m="http://schemas.openxmlformats.org/officeDocument/2006/math" xmlns:v="urn:schemas-microsoft-com:vml" xmlns:wp14="http://schemas.microsoft.com/office/word/2010/wordprocessingDrawing" xmlns:wp="http://schemas.openxmlformats.org/drawingml/2006/wordprocessingDrawing" xmlns:w10="urn:schemas-microsoft-com:office:word" xmlns:w="http://schemas.openxmlformats.org/wordprocessingml/2006/main" xmlns:w14="http://schemas.microsoft.com/office/word/2010/wordml" xmlns:w15="http://schemas.microsoft.com/office/word/2012/wordml" xmlns:w16cex="http://schemas.microsoft.com/office/word/2018/wordml/cex" xmlns:w16cid="http://schemas.microsoft.com/office/word/2016/wordml/cid" xmlns:w16="http://schemas.microsoft.com/office/word/2018/wordml" xmlns:w16du="http://schemas.microsoft.com/office/word/2023/wordml/word16du" xmlns:w16sdtdh="http://schemas.microsoft.com/office/word/2020/wordml/sdtdatahash" xmlns:w16sdtfl="http://schemas.microsoft.com/office/word/2024/wordml/sdtformatlock" xmlns:w16se="http://schemas.microsoft.com/office/word/2015/wordml/symex" xmlns:wpg="http://schemas.microsoft.com/office/word/2010/wordprocessingGroup" xmlns:wpi="http://schemas.microsoft.com/office/word/2010/wordprocessingInk" xmlns:wne="http://schemas.microsoft.com/office/word/2006/wordml" xmlns:wps="http://schemas.microsoft.com/office/word/2010/wordprocessingShape" mc:Ignorable="w14 w15 w16se w16cid w16 w16cex w16sdtdh w16sdtfl w16du wp14">
   <w15:person w15:author="GG">
     <w15:presenceInfo w15:providerId="None" w15:userId="GG"/>
+  </w15:person>
+  <w15:person w15:author="sevgi koyuncu">
+    <w15:presenceInfo w15:providerId="Windows Live" w15:userId="bb310e19c1d78bf1"/>
   </w15:person>
 </w15:people>
 </file>

</xml_diff>